<commit_message>
Engine: a heading-named topic counts as covered without changing the main topic
- The topic a section heading names is kept beside the classification and used only
  for coverage, so "TERM" or "GOVERNING LAW" sections no longer read as a secondary
  mention. The main topic, severity and check planning are unchanged.
- The survival check also accepts "termination does not affect obligations in respect
  of Confidential Information" and "the obligations of confidentiality continue for
  three years", with guards for negated and conditional wording.

Co-Authored-By: Claude Opus 5.5 <noreply@anthropic.com>
</commit_message>
<xml_diff>
--- a/backend/src/test/resources/fixtures/m7-msa-stated-survival.docx
+++ b/backend/src/test/resources/fixtures/m7-msa-stated-survival.docx
@@ -71,7 +71,15 @@
         <w:pStyle w:val="Normal"/>
       </w:pPr>
       <w:r>
-        <w:t xml:space="preserve">3.2 The obligations of confidentiality survive termination of this Agreement for five (5) years.</w:t>
+        <w:t xml:space="preserve">3.2 Termination does not affect obligations in respect of Confidential Information disclosed before termination.</w:t>
+      </w:r>
+    </w:p>
+    <w:p>
+      <w:pPr>
+        <w:pStyle w:val="Normal"/>
+      </w:pPr>
+      <w:r>
+        <w:t xml:space="preserve">3.3 The obligations of confidentiality and restricted use continue for three (3) years from the date of each disclosure, and indefinitely in respect of trade secrets.</w:t>
       </w:r>
     </w:p>
     <w:p>

</xml_diff>